<commit_message>
add slides generator, report outline, and update report
- Add tools/make_slides.py: HTML slide generator from results
- Add slides.html: generated presentation output
- Add CẤU TRÚC BÁO CÁO.docx: report structure outline
- Update results/BaoCao_TinyML_ECG.docx: latest report build
- Update tools/make_report.py: report generation improvements
- Ignore slide.pptx via .gitignore

Co-Authored-By: Claude Sonnet 4.6 <noreply@anthropic.com>
</commit_message>
<xml_diff>
--- a/results/BaoCao_TinyML_ECG.docx
+++ b/results/BaoCao_TinyML_ECG.docx
@@ -230,470 +230,6 @@
       </w:r>
       <w:r>
         <w:t>loại nhịp VẬT LÝ không dùng được (flatline/lead-off + bão hòa/clipping) theo tiêu chí tín hiệu khách quan — KHÔNG loại theo biên độ (tránh thiên lệch các nhịp bất thường biên độ lớn). Thực tế chỉ loại 6 nhịp toàn bộ (Normal=6, Abnormal=0 → không thiên lệch lớp), và DS2 mất 0 nhịp — bằng chứng KHÔNG cherry-pick tập test.</w:t>
-      </w:r>
-    </w:p>
-    <w:p>
-      <w:pPr>
-        <w:pStyle w:val="Heading2"/>
-      </w:pPr>
-      <w:r>
-        <w:rPr>
-          <w:color w:val="1F4E79"/>
-        </w:rPr>
-        <w:t>2.1. Tác động: precision @ recall 0.95 trước/sau làm sạch</w:t>
-      </w:r>
-    </w:p>
-    <w:tbl>
-      <w:tblPr>
-        <w:tblStyle w:val="TableGrid"/>
-        <w:tblW w:type="auto" w:w="0"/>
-        <w:jc w:val="center"/>
-        <w:tblLook w:firstColumn="1" w:firstRow="1" w:lastColumn="0" w:lastRow="0" w:noHBand="0" w:noVBand="1" w:val="04A0"/>
-      </w:tblPr>
-      <w:tblGrid>
-        <w:gridCol w:w="1728"/>
-        <w:gridCol w:w="1728"/>
-        <w:gridCol w:w="1728"/>
-        <w:gridCol w:w="1728"/>
-        <w:gridCol w:w="1728"/>
-      </w:tblGrid>
-      <w:tr>
-        <w:tc>
-          <w:tcPr>
-            <w:tcW w:type="dxa" w:w="1728"/>
-            <w:shd w:val="clear" w:fill="1F4E79"/>
-          </w:tcPr>
-          <w:p>
-            <w:r>
-              <w:rPr>
-                <w:b/>
-                <w:color w:val="FFFFFF"/>
-                <w:sz w:val="18"/>
-              </w:rPr>
-            </w:r>
-            <w:r>
-              <w:rPr>
-                <w:b/>
-                <w:color w:val="FFFFFF"/>
-                <w:sz w:val="18"/>
-              </w:rPr>
-              <w:t>Mô hình thắng (mỗi họ)</w:t>
-            </w:r>
-          </w:p>
-        </w:tc>
-        <w:tc>
-          <w:tcPr>
-            <w:tcW w:type="dxa" w:w="1728"/>
-            <w:shd w:val="clear" w:fill="1F4E79"/>
-          </w:tcPr>
-          <w:p>
-            <w:r>
-              <w:rPr>
-                <w:b/>
-                <w:color w:val="FFFFFF"/>
-                <w:sz w:val="18"/>
-              </w:rPr>
-            </w:r>
-            <w:r>
-              <w:rPr>
-                <w:b/>
-                <w:color w:val="FFFFFF"/>
-                <w:sz w:val="18"/>
-              </w:rPr>
-              <w:t>Trước (v1)</w:t>
-            </w:r>
-          </w:p>
-        </w:tc>
-        <w:tc>
-          <w:tcPr>
-            <w:tcW w:type="dxa" w:w="1728"/>
-            <w:shd w:val="clear" w:fill="1F4E79"/>
-          </w:tcPr>
-          <w:p>
-            <w:r>
-              <w:rPr>
-                <w:b/>
-                <w:color w:val="FFFFFF"/>
-                <w:sz w:val="18"/>
-              </w:rPr>
-            </w:r>
-            <w:r>
-              <w:rPr>
-                <w:b/>
-                <w:color w:val="FFFFFF"/>
-                <w:sz w:val="18"/>
-              </w:rPr>
-              <w:t>Sau (v2)</w:t>
-            </w:r>
-          </w:p>
-        </w:tc>
-        <w:tc>
-          <w:tcPr>
-            <w:tcW w:type="dxa" w:w="1728"/>
-            <w:shd w:val="clear" w:fill="1F4E79"/>
-          </w:tcPr>
-          <w:p>
-            <w:r>
-              <w:rPr>
-                <w:b/>
-                <w:color w:val="FFFFFF"/>
-                <w:sz w:val="18"/>
-              </w:rPr>
-            </w:r>
-            <w:r>
-              <w:rPr>
-                <w:b/>
-                <w:color w:val="FFFFFF"/>
-                <w:sz w:val="18"/>
-              </w:rPr>
-              <w:t>Δ</w:t>
-            </w:r>
-          </w:p>
-        </w:tc>
-        <w:tc>
-          <w:tcPr>
-            <w:tcW w:type="dxa" w:w="1728"/>
-            <w:shd w:val="clear" w:fill="1F4E79"/>
-          </w:tcPr>
-          <w:p>
-            <w:r>
-              <w:rPr>
-                <w:b/>
-                <w:color w:val="FFFFFF"/>
-                <w:sz w:val="18"/>
-              </w:rPr>
-            </w:r>
-            <w:r>
-              <w:rPr>
-                <w:b/>
-                <w:color w:val="FFFFFF"/>
-                <w:sz w:val="18"/>
-              </w:rPr>
-              <w:t>rec. triển khai (v2)</w:t>
-            </w:r>
-          </w:p>
-        </w:tc>
-      </w:tr>
-      <w:tr>
-        <w:tc>
-          <w:tcPr>
-            <w:tcW w:type="dxa" w:w="1728"/>
-          </w:tcPr>
-          <w:p>
-            <w:r/>
-            <w:r>
-              <w:rPr>
-                <w:b w:val="0"/>
-                <w:sz w:val="17"/>
-              </w:rPr>
-              <w:t>RF/n10_d5</w:t>
-            </w:r>
-          </w:p>
-        </w:tc>
-        <w:tc>
-          <w:tcPr>
-            <w:tcW w:type="dxa" w:w="1728"/>
-          </w:tcPr>
-          <w:p>
-            <w:r/>
-            <w:r>
-              <w:rPr>
-                <w:b w:val="0"/>
-                <w:sz w:val="17"/>
-              </w:rPr>
-              <w:t>0.110</w:t>
-            </w:r>
-          </w:p>
-        </w:tc>
-        <w:tc>
-          <w:tcPr>
-            <w:tcW w:type="dxa" w:w="1728"/>
-          </w:tcPr>
-          <w:p>
-            <w:r/>
-            <w:r>
-              <w:rPr>
-                <w:b w:val="0"/>
-                <w:sz w:val="17"/>
-              </w:rPr>
-              <w:t>0.127±0.01</w:t>
-            </w:r>
-          </w:p>
-        </w:tc>
-        <w:tc>
-          <w:tcPr>
-            <w:tcW w:type="dxa" w:w="1728"/>
-          </w:tcPr>
-          <w:p>
-            <w:r/>
-            <w:r>
-              <w:rPr>
-                <w:b w:val="0"/>
-                <w:sz w:val="17"/>
-              </w:rPr>
-              <w:t>+0.017</w:t>
-            </w:r>
-          </w:p>
-        </w:tc>
-        <w:tc>
-          <w:tcPr>
-            <w:tcW w:type="dxa" w:w="1728"/>
-          </w:tcPr>
-          <w:p>
-            <w:r/>
-            <w:r>
-              <w:rPr>
-                <w:b w:val="0"/>
-                <w:sz w:val="17"/>
-              </w:rPr>
-              <w:t>0.782</w:t>
-            </w:r>
-          </w:p>
-        </w:tc>
-      </w:tr>
-      <w:tr>
-        <w:tc>
-          <w:tcPr>
-            <w:tcW w:type="dxa" w:w="1728"/>
-          </w:tcPr>
-          <w:p>
-            <w:r/>
-            <w:r>
-              <w:rPr>
-                <w:b w:val="0"/>
-                <w:sz w:val="17"/>
-              </w:rPr>
-              <w:t>SVM/linear</w:t>
-            </w:r>
-          </w:p>
-        </w:tc>
-        <w:tc>
-          <w:tcPr>
-            <w:tcW w:type="dxa" w:w="1728"/>
-          </w:tcPr>
-          <w:p>
-            <w:r/>
-            <w:r>
-              <w:rPr>
-                <w:b w:val="0"/>
-                <w:sz w:val="17"/>
-              </w:rPr>
-              <w:t>0.170</w:t>
-            </w:r>
-          </w:p>
-        </w:tc>
-        <w:tc>
-          <w:tcPr>
-            <w:tcW w:type="dxa" w:w="1728"/>
-          </w:tcPr>
-          <w:p>
-            <w:r/>
-            <w:r>
-              <w:rPr>
-                <w:b w:val="0"/>
-                <w:sz w:val="17"/>
-              </w:rPr>
-              <w:t>0.193±0.00</w:t>
-            </w:r>
-          </w:p>
-        </w:tc>
-        <w:tc>
-          <w:tcPr>
-            <w:tcW w:type="dxa" w:w="1728"/>
-          </w:tcPr>
-          <w:p>
-            <w:r/>
-            <w:r>
-              <w:rPr>
-                <w:b w:val="0"/>
-                <w:sz w:val="17"/>
-              </w:rPr>
-              <w:t>+0.023</w:t>
-            </w:r>
-          </w:p>
-        </w:tc>
-        <w:tc>
-          <w:tcPr>
-            <w:tcW w:type="dxa" w:w="1728"/>
-          </w:tcPr>
-          <w:p>
-            <w:r/>
-            <w:r>
-              <w:rPr>
-                <w:b w:val="0"/>
-                <w:sz w:val="17"/>
-              </w:rPr>
-              <w:t>0.918</w:t>
-            </w:r>
-          </w:p>
-        </w:tc>
-      </w:tr>
-      <w:tr>
-        <w:tc>
-          <w:tcPr>
-            <w:tcW w:type="dxa" w:w="1728"/>
-          </w:tcPr>
-          <w:p>
-            <w:r/>
-            <w:r>
-              <w:rPr>
-                <w:b w:val="0"/>
-                <w:sz w:val="17"/>
-              </w:rPr>
-              <w:t>CNN/c8-16</w:t>
-            </w:r>
-          </w:p>
-        </w:tc>
-        <w:tc>
-          <w:tcPr>
-            <w:tcW w:type="dxa" w:w="1728"/>
-          </w:tcPr>
-          <w:p>
-            <w:r/>
-            <w:r>
-              <w:rPr>
-                <w:b w:val="0"/>
-                <w:sz w:val="17"/>
-              </w:rPr>
-              <w:t>0.242</w:t>
-            </w:r>
-          </w:p>
-        </w:tc>
-        <w:tc>
-          <w:tcPr>
-            <w:tcW w:type="dxa" w:w="1728"/>
-          </w:tcPr>
-          <w:p>
-            <w:r/>
-            <w:r>
-              <w:rPr>
-                <w:b w:val="0"/>
-                <w:sz w:val="17"/>
-              </w:rPr>
-              <w:t>0.172±0.05</w:t>
-            </w:r>
-          </w:p>
-        </w:tc>
-        <w:tc>
-          <w:tcPr>
-            <w:tcW w:type="dxa" w:w="1728"/>
-          </w:tcPr>
-          <w:p>
-            <w:r/>
-            <w:r>
-              <w:rPr>
-                <w:b w:val="0"/>
-                <w:sz w:val="17"/>
-              </w:rPr>
-              <w:t>-0.070</w:t>
-            </w:r>
-          </w:p>
-        </w:tc>
-        <w:tc>
-          <w:tcPr>
-            <w:tcW w:type="dxa" w:w="1728"/>
-          </w:tcPr>
-          <w:p>
-            <w:r/>
-            <w:r>
-              <w:rPr>
-                <w:b w:val="0"/>
-                <w:sz w:val="17"/>
-              </w:rPr>
-              <w:t>0.965</w:t>
-            </w:r>
-          </w:p>
-        </w:tc>
-      </w:tr>
-      <w:tr>
-        <w:tc>
-          <w:tcPr>
-            <w:tcW w:type="dxa" w:w="1728"/>
-          </w:tcPr>
-          <w:p>
-            <w:r/>
-            <w:r>
-              <w:rPr>
-                <w:b w:val="0"/>
-                <w:sz w:val="17"/>
-              </w:rPr>
-              <w:t>LSTM/h8</w:t>
-            </w:r>
-          </w:p>
-        </w:tc>
-        <w:tc>
-          <w:tcPr>
-            <w:tcW w:type="dxa" w:w="1728"/>
-          </w:tcPr>
-          <w:p>
-            <w:r/>
-            <w:r>
-              <w:rPr>
-                <w:b w:val="0"/>
-                <w:sz w:val="17"/>
-              </w:rPr>
-              <w:t>0.147</w:t>
-            </w:r>
-          </w:p>
-        </w:tc>
-        <w:tc>
-          <w:tcPr>
-            <w:tcW w:type="dxa" w:w="1728"/>
-          </w:tcPr>
-          <w:p>
-            <w:r/>
-            <w:r>
-              <w:rPr>
-                <w:b w:val="0"/>
-                <w:sz w:val="17"/>
-              </w:rPr>
-              <w:t>0.152±0.01</w:t>
-            </w:r>
-          </w:p>
-        </w:tc>
-        <w:tc>
-          <w:tcPr>
-            <w:tcW w:type="dxa" w:w="1728"/>
-          </w:tcPr>
-          <w:p>
-            <w:r/>
-            <w:r>
-              <w:rPr>
-                <w:b w:val="0"/>
-                <w:sz w:val="17"/>
-              </w:rPr>
-              <w:t>+0.005</w:t>
-            </w:r>
-          </w:p>
-        </w:tc>
-        <w:tc>
-          <w:tcPr>
-            <w:tcW w:type="dxa" w:w="1728"/>
-          </w:tcPr>
-          <w:p>
-            <w:r/>
-            <w:r>
-              <w:rPr>
-                <w:b w:val="0"/>
-                <w:sz w:val="17"/>
-              </w:rPr>
-              <w:t>0.987</w:t>
-            </w:r>
-          </w:p>
-        </w:tc>
-      </w:tr>
-    </w:tbl>
-    <w:p>
-      <w:pPr>
-        <w:spacing w:after="200"/>
-      </w:pPr>
-      <w:r>
-        <w:rPr>
-          <w:i/>
-          <w:color w:val="595959"/>
-          <w:sz w:val="19"/>
-        </w:rPr>
-        <w:t>“Trước (v1)” = cùng cấu hình train trên dữ liệu CHƯA làm sạch (single-run); “Sau (v2)” = trung bình ± std trên nhiều seed sau làm sạch. Phần lớn Δ nằm trong dải nhiễu seed của CNN/LSTM — cho thấy tác động chính của làm sạch là sửa lỗi (lead/RR) chứ không phải thổi phồng chất lượng.</w:t>
       </w:r>
     </w:p>
     <w:p>

</xml_diff>